<commit_message>
Updated the API Documetation file
</commit_message>
<xml_diff>
--- a/Task_Management_System_API_Details.docx
+++ b/Task_Management_System_API_Details.docx
@@ -13,6 +13,40 @@
       <w:r>
         <w:br/>
       </w:r>
+    </w:p>
+    <w:p>
+      <w:r>
+        <w:t>## Setup</w:t>
+      </w:r>
+      <w:r>
+        <w:br/>
+        <w:t>1. Clone repo</w:t>
+      </w:r>
+      <w:r>
+        <w:br/>
+        <w:t>2. Import database (if any)</w:t>
+      </w:r>
+      <w:r>
+        <w:br/>
+        <w:t>3. Run on XAMPP</w:t>
+      </w:r>
+      <w:r>
+        <w:br/>
+        <w:t>4. Open:</w:t>
+      </w:r>
+      <w:r>
+        <w:br/>
+      </w:r>
+      <w:hyperlink r:id="rId5" w:history="1">
+        <w:r>
+          <w:rPr>
+            <w:rStyle w:val="Hyperlink"/>
+          </w:rPr>
+          <w:t>http://localhost/codeIgniter/task_mngt/index.php/tasks/view_page</w:t>
+        </w:r>
+      </w:hyperlink>
+    </w:p>
+    <w:p>
       <w:r>
         <w:br/>
         <w:t>APIS</w:t>
@@ -175,13 +209,18 @@
       <w:r>
         <w:t xml:space="preserve">            "</w:t>
       </w:r>
+      <w:proofErr w:type="spellStart"/>
       <w:proofErr w:type="gramStart"/>
       <w:r>
         <w:t>due</w:t>
       </w:r>
       <w:proofErr w:type="gramEnd"/>
       <w:r>
-        <w:t>_date": "2026-04-18 16:00:00",</w:t>
+        <w:t>_date</w:t>
+      </w:r>
+      <w:proofErr w:type="spellEnd"/>
+      <w:r>
+        <w:t>": "2026-04-18 16:00:00",</w:t>
       </w:r>
     </w:p>
     <w:p>
@@ -197,13 +236,7 @@
         <w:pStyle w:val="ListParagraph"/>
       </w:pPr>
       <w:r>
-        <w:t xml:space="preserve">            "status": "</w:t>
-      </w:r>
-      <w:r>
-        <w:t>pending</w:t>
-      </w:r>
-      <w:r>
-        <w:t>",</w:t>
+        <w:t xml:space="preserve">            "status": "pending",</w:t>
       </w:r>
     </w:p>
     <w:p>
@@ -213,13 +246,18 @@
       <w:r>
         <w:t xml:space="preserve">            "</w:t>
       </w:r>
+      <w:proofErr w:type="spellStart"/>
       <w:proofErr w:type="gramStart"/>
       <w:r>
         <w:t>created</w:t>
       </w:r>
       <w:proofErr w:type="gramEnd"/>
       <w:r>
-        <w:t>_at": "2026-04-18 10:42:25"</w:t>
+        <w:t>_at</w:t>
+      </w:r>
+      <w:proofErr w:type="spellEnd"/>
+      <w:r>
+        <w:t>": "2026-04-18 10:42:25"</w:t>
       </w:r>
     </w:p>
     <w:p>
@@ -261,13 +299,18 @@
       <w:r>
         <w:t xml:space="preserve">            "</w:t>
       </w:r>
+      <w:proofErr w:type="spellStart"/>
       <w:proofErr w:type="gramStart"/>
       <w:r>
         <w:t>due</w:t>
       </w:r>
       <w:proofErr w:type="gramEnd"/>
       <w:r>
-        <w:t>_date": "2026-04-20 10:00:00",</w:t>
+        <w:t>_date</w:t>
+      </w:r>
+      <w:proofErr w:type="spellEnd"/>
+      <w:r>
+        <w:t>": "2026-04-20 10:00:00",</w:t>
       </w:r>
     </w:p>
     <w:p>
@@ -293,13 +336,108 @@
       <w:r>
         <w:t xml:space="preserve">            "</w:t>
       </w:r>
+      <w:proofErr w:type="spellStart"/>
       <w:proofErr w:type="gramStart"/>
       <w:r>
         <w:t>created</w:t>
       </w:r>
       <w:proofErr w:type="gramEnd"/>
       <w:r>
-        <w:t>_at": "2026-04-18 11:10:31"</w:t>
+        <w:t>_at</w:t>
+      </w:r>
+      <w:proofErr w:type="spellEnd"/>
+      <w:r>
+        <w:t>": "2026-04-18 11:10:31"</w:t>
+      </w:r>
+    </w:p>
+    <w:p>
+      <w:pPr>
+        <w:pStyle w:val="ListParagraph"/>
+      </w:pPr>
+      <w:r>
+        <w:t xml:space="preserve">        },</w:t>
+      </w:r>
+    </w:p>
+    <w:p>
+      <w:pPr>
+        <w:pStyle w:val="ListParagraph"/>
+      </w:pPr>
+      <w:r>
+        <w:t xml:space="preserve">        {</w:t>
+      </w:r>
+    </w:p>
+    <w:p>
+      <w:pPr>
+        <w:pStyle w:val="ListParagraph"/>
+      </w:pPr>
+      <w:r>
+        <w:t xml:space="preserve">            "id": "1",</w:t>
+      </w:r>
+    </w:p>
+    <w:p>
+      <w:pPr>
+        <w:pStyle w:val="ListParagraph"/>
+      </w:pPr>
+      <w:r>
+        <w:t xml:space="preserve">            "title": "Task1",</w:t>
+      </w:r>
+    </w:p>
+    <w:p>
+      <w:pPr>
+        <w:pStyle w:val="ListParagraph"/>
+      </w:pPr>
+      <w:r>
+        <w:t xml:space="preserve">            "</w:t>
+      </w:r>
+      <w:proofErr w:type="spellStart"/>
+      <w:proofErr w:type="gramStart"/>
+      <w:r>
+        <w:t>due</w:t>
+      </w:r>
+      <w:proofErr w:type="gramEnd"/>
+      <w:r>
+        <w:t>_date</w:t>
+      </w:r>
+      <w:proofErr w:type="spellEnd"/>
+      <w:r>
+        <w:t>": "2026-05-01 12:00:00",</w:t>
+      </w:r>
+    </w:p>
+    <w:p>
+      <w:pPr>
+        <w:pStyle w:val="ListParagraph"/>
+      </w:pPr>
+      <w:r>
+        <w:t xml:space="preserve">            "priority": "2",</w:t>
+      </w:r>
+    </w:p>
+    <w:p>
+      <w:pPr>
+        <w:pStyle w:val="ListParagraph"/>
+      </w:pPr>
+      <w:r>
+        <w:t xml:space="preserve">            "status": "completed",</w:t>
+      </w:r>
+    </w:p>
+    <w:p>
+      <w:pPr>
+        <w:pStyle w:val="ListParagraph"/>
+      </w:pPr>
+      <w:r>
+        <w:t xml:space="preserve">            "</w:t>
+      </w:r>
+      <w:proofErr w:type="spellStart"/>
+      <w:proofErr w:type="gramStart"/>
+      <w:r>
+        <w:t>created</w:t>
+      </w:r>
+      <w:proofErr w:type="gramEnd"/>
+      <w:r>
+        <w:t>_at</w:t>
+      </w:r>
+      <w:proofErr w:type="spellEnd"/>
+      <w:r>
+        <w:t>": "2026-04-18 10:41:01"</w:t>
       </w:r>
     </w:p>
     <w:p>
@@ -309,89 +447,6 @@
       <w:r>
         <w:t xml:space="preserve">        }</w:t>
       </w:r>
-      <w:r>
-        <w:t>,</w:t>
-      </w:r>
-    </w:p>
-    <w:p>
-      <w:pPr>
-        <w:pStyle w:val="ListParagraph"/>
-      </w:pPr>
-      <w:r>
-        <w:t xml:space="preserve">        {</w:t>
-      </w:r>
-    </w:p>
-    <w:p>
-      <w:pPr>
-        <w:pStyle w:val="ListParagraph"/>
-      </w:pPr>
-      <w:r>
-        <w:t xml:space="preserve">            "id": "1",</w:t>
-      </w:r>
-    </w:p>
-    <w:p>
-      <w:pPr>
-        <w:pStyle w:val="ListParagraph"/>
-      </w:pPr>
-      <w:r>
-        <w:t xml:space="preserve">            "title": "Task1",</w:t>
-      </w:r>
-    </w:p>
-    <w:p>
-      <w:pPr>
-        <w:pStyle w:val="ListParagraph"/>
-      </w:pPr>
-      <w:r>
-        <w:t xml:space="preserve">            "</w:t>
-      </w:r>
-      <w:proofErr w:type="gramStart"/>
-      <w:r>
-        <w:t>due</w:t>
-      </w:r>
-      <w:proofErr w:type="gramEnd"/>
-      <w:r>
-        <w:t>_date": "2026-05-01 12:00:00",</w:t>
-      </w:r>
-    </w:p>
-    <w:p>
-      <w:pPr>
-        <w:pStyle w:val="ListParagraph"/>
-      </w:pPr>
-      <w:r>
-        <w:t xml:space="preserve">            "priority": "2",</w:t>
-      </w:r>
-    </w:p>
-    <w:p>
-      <w:pPr>
-        <w:pStyle w:val="ListParagraph"/>
-      </w:pPr>
-      <w:r>
-        <w:t xml:space="preserve">            "status": "completed",</w:t>
-      </w:r>
-    </w:p>
-    <w:p>
-      <w:pPr>
-        <w:pStyle w:val="ListParagraph"/>
-      </w:pPr>
-      <w:r>
-        <w:t xml:space="preserve">            "</w:t>
-      </w:r>
-      <w:proofErr w:type="gramStart"/>
-      <w:r>
-        <w:t>created</w:t>
-      </w:r>
-      <w:proofErr w:type="gramEnd"/>
-      <w:r>
-        <w:t>_at": "2026-04-18 10:41:01"</w:t>
-      </w:r>
-    </w:p>
-    <w:p>
-      <w:pPr>
-        <w:pStyle w:val="ListParagraph"/>
-      </w:pPr>
-      <w:r>
-        <w:t xml:space="preserve">        }</w:t>
-      </w:r>
     </w:p>
     <w:p>
       <w:pPr>
@@ -414,13 +469,7 @@
         <w:pStyle w:val="ListParagraph"/>
       </w:pPr>
       <w:r>
-        <w:t xml:space="preserve">        "total": </w:t>
-      </w:r>
-      <w:r>
-        <w:t>3</w:t>
-      </w:r>
-      <w:r>
-        <w:t>,</w:t>
+        <w:t xml:space="preserve">        "total": 3,</w:t>
       </w:r>
     </w:p>
     <w:p>
@@ -436,17 +485,15 @@
         <w:pStyle w:val="ListParagraph"/>
       </w:pPr>
       <w:r>
-        <w:t xml:space="preserve">        "completed": </w:t>
-      </w:r>
-      <w:r>
-        <w:t>2</w:t>
-      </w:r>
-    </w:p>
-    <w:p>
-      <w:pPr>
-        <w:pStyle w:val="ListParagraph"/>
-      </w:pPr>
-      <w:r>
+        <w:t xml:space="preserve">        "completed": 2</w:t>
+      </w:r>
+    </w:p>
+    <w:p>
+      <w:pPr>
+        <w:pStyle w:val="ListParagraph"/>
+      </w:pPr>
+      <w:r>
+        <w:lastRenderedPageBreak/>
         <w:t xml:space="preserve">    }</w:t>
       </w:r>
     </w:p>
@@ -513,10 +560,7 @@
         <w:t>:</w:t>
       </w:r>
       <w:r>
-        <w:t xml:space="preserve"> </w:t>
-      </w:r>
-      <w:r>
-        <w:t>POST</w:t>
+        <w:t xml:space="preserve"> POST</w:t>
       </w:r>
     </w:p>
     <w:p>
@@ -556,7 +600,6 @@
           <w:b/>
           <w:bCs/>
         </w:rPr>
-        <w:lastRenderedPageBreak/>
         <w:t>Response</w:t>
       </w:r>
       <w:r>
@@ -658,10 +701,7 @@
         <w:t>:</w:t>
       </w:r>
       <w:r>
-        <w:t xml:space="preserve"> </w:t>
-      </w:r>
-      <w:r>
-        <w:t>PUT</w:t>
+        <w:t xml:space="preserve"> PUT</w:t>
       </w:r>
     </w:p>
     <w:p>
@@ -811,10 +851,7 @@
         <w:t>:</w:t>
       </w:r>
       <w:r>
-        <w:t xml:space="preserve"> </w:t>
-      </w:r>
-      <w:r>
-        <w:t>DELETE</w:t>
+        <w:t xml:space="preserve"> DELETE</w:t>
       </w:r>
     </w:p>
     <w:p>
@@ -845,13 +882,7 @@
         <w:t>/tasks/</w:t>
       </w:r>
       <w:r>
-        <w:t>delete</w:t>
-      </w:r>
-      <w:r>
-        <w:t>/</w:t>
-      </w:r>
-      <w:r>
-        <w:t>6</w:t>
+        <w:t>delete/6</w:t>
       </w:r>
     </w:p>
     <w:p>
@@ -882,13 +913,7 @@
         <w:ind w:left="720"/>
       </w:pPr>
       <w:r>
-        <w:t xml:space="preserve">    "message": "Task </w:t>
-      </w:r>
-      <w:r>
-        <w:t>deleted</w:t>
-      </w:r>
-      <w:r>
-        <w:t>"</w:t>
+        <w:t xml:space="preserve">    "message": "Task deleted"</w:t>
       </w:r>
     </w:p>
     <w:p>
@@ -954,13 +979,7 @@
         <w:t xml:space="preserve"> </w:t>
       </w:r>
       <w:r>
-        <w:t>tasks</w:t>
-      </w:r>
-      <w:r>
-        <w:t xml:space="preserve"> </w:t>
-      </w:r>
-      <w:r>
-        <w:t>/</w:t>
+        <w:t>tasks /</w:t>
       </w:r>
       <w:r>
         <w:t>$id</w:t>
@@ -981,10 +1000,7 @@
         <w:t>:</w:t>
       </w:r>
       <w:r>
-        <w:t xml:space="preserve"> </w:t>
-      </w:r>
-      <w:r>
-        <w:t>GET</w:t>
+        <w:t xml:space="preserve"> GET</w:t>
       </w:r>
     </w:p>
     <w:p>
@@ -996,6 +1012,7 @@
           <w:b/>
           <w:bCs/>
         </w:rPr>
+        <w:lastRenderedPageBreak/>
         <w:t>Request</w:t>
       </w:r>
       <w:r>
@@ -1015,10 +1032,7 @@
         <w:t>/tasks</w:t>
       </w:r>
       <w:r>
-        <w:t xml:space="preserve"> </w:t>
-      </w:r>
-      <w:r>
-        <w:t>/</w:t>
+        <w:t xml:space="preserve"> /</w:t>
       </w:r>
       <w:r>
         <w:t>1</w:t>
@@ -1070,13 +1084,18 @@
       <w:r>
         <w:t xml:space="preserve">            "</w:t>
       </w:r>
+      <w:proofErr w:type="spellStart"/>
       <w:proofErr w:type="gramStart"/>
       <w:r>
         <w:t>due</w:t>
       </w:r>
       <w:proofErr w:type="gramEnd"/>
       <w:r>
-        <w:t>_date": "2026-05-01 12:00:00",</w:t>
+        <w:t>_date</w:t>
+      </w:r>
+      <w:proofErr w:type="spellEnd"/>
+      <w:r>
+        <w:t>": "2026-05-01 12:00:00",</w:t>
       </w:r>
     </w:p>
     <w:p>
@@ -1092,7 +1111,6 @@
         <w:pStyle w:val="ListParagraph"/>
       </w:pPr>
       <w:r>
-        <w:lastRenderedPageBreak/>
         <w:t xml:space="preserve">            "status": "completed",</w:t>
       </w:r>
     </w:p>
@@ -1103,13 +1121,18 @@
       <w:r>
         <w:t xml:space="preserve">            "</w:t>
       </w:r>
+      <w:proofErr w:type="spellStart"/>
       <w:proofErr w:type="gramStart"/>
       <w:r>
         <w:t>created</w:t>
       </w:r>
       <w:proofErr w:type="gramEnd"/>
       <w:r>
-        <w:t>_at": "2026-04-18 10:41:01"</w:t>
+        <w:t>_at</w:t>
+      </w:r>
+      <w:proofErr w:type="spellEnd"/>
+      <w:r>
+        <w:t>": "2026-04-18 10:41:01"</w:t>
       </w:r>
     </w:p>
     <w:p>
@@ -1222,10 +1245,7 @@
         <w:t>/tasks</w:t>
       </w:r>
       <w:r>
-        <w:t xml:space="preserve"> /</w:t>
-      </w:r>
-      <w:r>
-        <w:t>count</w:t>
+        <w:t xml:space="preserve"> /count</w:t>
       </w:r>
     </w:p>
     <w:p>
@@ -1256,38 +1276,23 @@
         <w:pStyle w:val="ListParagraph"/>
       </w:pPr>
       <w:r>
-        <w:t xml:space="preserve">    "total": </w:t>
-      </w:r>
-      <w:r>
-        <w:t>3</w:t>
-      </w:r>
-      <w:r>
-        <w:t>,</w:t>
-      </w:r>
-    </w:p>
-    <w:p>
-      <w:pPr>
-        <w:pStyle w:val="ListParagraph"/>
-      </w:pPr>
-      <w:r>
-        <w:t xml:space="preserve">    "pending": </w:t>
-      </w:r>
-      <w:r>
-        <w:t>1</w:t>
-      </w:r>
-      <w:r>
-        <w:t>,</w:t>
-      </w:r>
-    </w:p>
-    <w:p>
-      <w:pPr>
-        <w:pStyle w:val="ListParagraph"/>
-      </w:pPr>
-      <w:r>
-        <w:t xml:space="preserve">    "completed": </w:t>
-      </w:r>
-      <w:r>
-        <w:t>2</w:t>
+        <w:t xml:space="preserve">    "total": 3,</w:t>
+      </w:r>
+    </w:p>
+    <w:p>
+      <w:pPr>
+        <w:pStyle w:val="ListParagraph"/>
+      </w:pPr>
+      <w:r>
+        <w:t xml:space="preserve">    "pending": 1,</w:t>
+      </w:r>
+    </w:p>
+    <w:p>
+      <w:pPr>
+        <w:pStyle w:val="ListParagraph"/>
+      </w:pPr>
+      <w:r>
+        <w:t xml:space="preserve">    "completed": 2</w:t>
       </w:r>
     </w:p>
     <w:p>
@@ -2470,6 +2475,29 @@
       <w:spacing w:val="5"/>
     </w:rPr>
   </w:style>
+  <w:style w:type="character" w:styleId="Hyperlink">
+    <w:name w:val="Hyperlink"/>
+    <w:basedOn w:val="DefaultParagraphFont"/>
+    <w:uiPriority w:val="99"/>
+    <w:unhideWhenUsed/>
+    <w:rsid w:val="006D1660"/>
+    <w:rPr>
+      <w:color w:val="467886" w:themeColor="hyperlink"/>
+      <w:u w:val="single"/>
+    </w:rPr>
+  </w:style>
+  <w:style w:type="character" w:styleId="UnresolvedMention">
+    <w:name w:val="Unresolved Mention"/>
+    <w:basedOn w:val="DefaultParagraphFont"/>
+    <w:uiPriority w:val="99"/>
+    <w:semiHidden/>
+    <w:unhideWhenUsed/>
+    <w:rsid w:val="006D1660"/>
+    <w:rPr>
+      <w:color w:val="605E5C"/>
+      <w:shd w:val="clear" w:color="auto" w:fill="E1DFDD"/>
+    </w:rPr>
+  </w:style>
 </w:styles>
 </file>
 

</xml_diff>